<commit_message>
Rewrite proposal wording to reduce text overlap
</commit_message>
<xml_diff>
--- a/开题报告_赵彦丞.docx
+++ b/开题报告_赵彦丞.docx
@@ -589,40 +589,40 @@
               <w:rPr>
                 <w:lang w:val="zh-CN"/>
               </w:rPr>
-              <w:t>语义分割是计算机视觉领域的一项基础任务，其目标是为图像中的每一个像素分配语义类别，在自动驾驶、医学影像分析、遥感图像解译和智能机器人等领域有着广泛的应用。随着深度学习技术的发展，以全卷积网络和DeepLab系列为代表的分割模型不断提升分割精度，语义分割已成为场景理解的核心技术之一。因此，研究高效、准确的语义分割方法，对推动相关领域的智能化发展具有重要意义。</w:t>
-            </w:r>
-          </w:p>
-          <w:p>
-            <w:pPr>
-              <w:pStyle w:val="6"/>
-            </w:pPr>
-            <w:r>
-              <w:rPr>
-                <w:lang w:val="zh-CN"/>
-              </w:rPr>
-              <w:t>然而，高精度的分割模型通常依赖大规模的像素级标注数据。像素级标注需要逐像素勾画目标轮廓，费时费力，以城市街景数据集Cityscapes为例，每张图像的精细标注平均需要1.5小时以上。特别是在医学影像等需要专业知识的领域，标注成本更高。半监督语义分割利用少量有标注图像和大量无标注图像共同训练模型，能够在降低标注需求的同时保持较高的分割精度。近年来，基于伪标签与一致性正则的方法成为主流：模型利用弱增强图像的预测生成伪标签，用以监督强增强图像的预测。UniMatch、CorrMatch等方法在少标注条件下取得了显著成果，为降低语义分割的标注成本提供了新的技术路径。</w:t>
-            </w:r>
-          </w:p>
-          <w:p>
-            <w:pPr>
-              <w:pStyle w:val="6"/>
-            </w:pPr>
-            <w:r>
-              <w:rPr>
-                <w:lang w:val="zh-CN"/>
-              </w:rPr>
-              <w:t>半监督语义分割的难点在于，模型为无标注图像生成的伪标签不可避免地含有噪声，错误的伪标签会在训练中不断累积，且目标边界、小目标和外观相近类别的区域最容易出错。此外，现有的一致性约束大多逐像素地比较预测结果，对相邻像素之间的局部空间结构缺少显式约束。近期提出的导数标签传播方法（DerProp）在特征的通道维度上引入一阶、二阶离散差分，以约束像素间相似度的计算，但并未在空间维度上约束预测结果的局部变化。</w:t>
-            </w:r>
-          </w:p>
-          <w:p>
-            <w:pPr>
-              <w:pStyle w:val="6"/>
-            </w:pPr>
-            <w:r>
-              <w:rPr>
-                <w:lang w:val="zh-CN"/>
-              </w:rPr>
-              <w:t>二阶差分是数字图像处理中刻画局部结构的经典工具，在平坦区域接近于零，在边缘和细节处响应强烈。本研究旨在以CorrMatch和DerProp为基础框架，构建一个基于二阶差分的半监督语义分割模型。通过在高置信度伪标签区域引入空间二阶差分结构一致性约束，使模型在逐像素一致性之外进一步学习预测结果的边界与局部结构信息，提升模型在少量标注条件下的分割精度与边界刻画能力。本研究的成果可为自动驾驶、医学影像等标注成本较高的应用场景提供技术支持，对推动半监督语义分割技术的发展具有重要的理论价值与实践意义。</w:t>
+              <w:t>语义分割要求模型对图像中的每个像素作出类别判断，得到与原图尺寸一致的类别图。自动驾驶车辆依靠它区分车道、行人与车辆，医生借助它勾画病灶和器官的轮廓，遥感解译则用它统计地物的分布范围。自全卷积网络把分类网络改造为端到端的逐像素预测结构以来，DeepLab等模型借助空洞卷积和编解码结构持续提高分割精度。分割结果直接影响后续的分析与决策，提高分割精度始终是这一方向的核心目标。</w:t>
+            </w:r>
+          </w:p>
+          <w:p>
+            <w:pPr>
+              <w:pStyle w:val="6"/>
+            </w:pPr>
+            <w:r>
+              <w:rPr>
+                <w:lang w:val="zh-CN"/>
+              </w:rPr>
+              <w:t>精度的提升离不开大量像素级标注，而这类标注的获取代价很高。标注人员需要沿目标边缘逐点勾画轮廓，在Cityscapes数据集中，一幅街景图像的精细标注连同质量检查平均要花费1.5小时以上；医学影像的标注还需要具备专业知识的医生参与，成本更高。半监督语义分割只对少量图像进行标注，让模型同时从有标注和无标注的图像中学习，力求用较少的标注达到接近全监督训练的精度。目前常用的做法是自训练：模型先对经过轻微变换的无标注图像进行预测，取其中把握较大的部分作为伪标签，再要求模型对同一幅图像施加强扰动后给出相同的结果。沿着这一思路，UniMatch和CorrMatch等工作在仅有几十到几百张标注图像时，已经能取得较好的分割效果。</w:t>
+            </w:r>
+          </w:p>
+          <w:p>
+            <w:pPr>
+              <w:pStyle w:val="6"/>
+            </w:pPr>
+            <w:r>
+              <w:rPr>
+                <w:lang w:val="zh-CN"/>
+              </w:rPr>
+              <w:t>这一思路的薄弱环节在于伪标签并不完全可靠。模型在训练早期的预测本身含有错误，这些错误一旦被当作监督信号，就会在后续训练中被反复强化，而最容易出错的恰恰是目标边缘、细小目标以及外观相似的类别。另一方面，现有方法对强、弱两种预测的约束大多逐像素进行，只要求同一位置的类别相同，并不关心相邻像素之间的预测如何过渡，对边界形状缺少直接的约束。DerProp方法对像素特征沿通道方向计算一阶、二阶差分，用来改进像素间相似度的度量，但差分没有沿图像的空间方向展开，同样没有约束预测图的局部结构。</w:t>
+            </w:r>
+          </w:p>
+          <w:p>
+            <w:pPr>
+              <w:pStyle w:val="6"/>
+            </w:pPr>
+            <w:r>
+              <w:rPr>
+                <w:lang w:val="zh-CN"/>
+              </w:rPr>
+              <w:t>在经典图像处理中，二阶差分（二维情形下即拉普拉斯算子）常用于边缘检测：在灰度均匀或线性变化的区域，其响应为零；在边缘两侧，会出现符号相反的响应，过零点正好对应边缘位置。这一性质可以直接用来刻画分割预测图在局部的变化形态。本课题在CorrMatch与DerProp的框架上，沿预测概率图的水平和竖直方向计算二阶差分，并在伪标签可靠的区域内要求强、弱两种预测的二阶差分保持一致，使模型在学习每个像素所属类别的同时，也学习相邻像素之间的过渡方式，从而改善少标注条件下目标边界和细小目标的分割质量。课题成果有助于降低自动驾驶、医学影像等场景对人工标注的依赖，也能为传统差分算子在深度半监督学习中的应用提供实验参考，具有一定的研究价值和应用前景。</w:t>
             </w:r>
           </w:p>
           <w:p>
@@ -952,7 +952,7 @@
               <w:rPr>
                 <w:lang w:val="zh-CN"/>
               </w:rPr>
-              <w:t>本研究拟构建一个基于二阶差分的半监督语义分割模型，主要内容如下：</w:t>
+              <w:t>围绕上述问题，本课题的研究内容包括以下四个部分：</w:t>
             </w:r>
           </w:p>
           <w:p>
@@ -975,7 +975,7 @@
               <w:rPr>
                 <w:lang w:val="zh-CN"/>
               </w:rPr>
-              <w:t>语义分割在自动驾驶、医学影像等领域应用广泛，但高精度的分割模型依赖大量像素级标注，标注成本高昂。半监督语义分割利用少量有标注图像和大量无标注图像共同训练模型，可有效降低对标注数据的依赖。然而，伪标签中的噪声会在训练中不断累积，目标边界和小目标区域尤其容易出错，现有的一致性约束对局部空间结构的利用也较为有限。本研究旨在构建基于二阶差分的半监督语义分割模型，通过引入空间二阶差分结构一致性约束，提升模型在少量标注条件下的分割精度与边界刻画能力，为低标注成本的分割应用提供技术支持。</w:t>
+              <w:t>首先梳理语义分割与半监督学习的发展过程，重点分析基于伪标签的自训练方法和基于像素相关性的标签传播方法，归纳它们在伪标签噪声和边界刻画方面存在的不足。随后说明二阶差分在图像处理中描述边缘与局部结构的原理，以及把它引入半监督分割的动机：逐像素一致性无法约束相邻像素之间的过渡，而二阶差分恰好可以弥补这一点。最后明确本课题的研究目标，即在少量标注条件下提高分割精度，并改善目标边界的分割效果。</w:t>
             </w:r>
           </w:p>
           <w:p>
@@ -1016,7 +1016,7 @@
               <w:rPr>
                 <w:lang w:val="zh-CN"/>
               </w:rPr>
-              <w:t>以ResNet-101为骨干网络、DeepLabV3+为分割头构建分割模型，复现CorrMatch和DerProp两种半监督方法作为基线：利用弱增强图像的预测生成伪标签，监督强增强图像的预测，并通过自适应阈值筛选和像素相关性传播扩展高置信度区域。在此基础上设计空间二阶差分结构一致性模块，沿水平和竖直方向计算类别概率图的二阶差分，在高置信度伪标签区域内约束强、弱增强图像预测的二阶差分保持一致，并将该约束加权加入总损失。同时设计一阶空间差分约束作为对照，验证二阶结构信息的作用。</w:t>
+              <w:t>分割网络采用ResNet-101骨干与DeepLabV3+解码结构。依托CorrMatch与DerProp的公开代码复现这两种方法，作为对比基线，其训练流程包括由弱增强图像生成伪标签、强增强与CutMix扰动、自适应阈值筛选和相关性标签传播。随后在基线之上加入空间二阶差分结构一致性模块：对强、弱两种预测的概率图分别计算水平与竖直方向的二阶差分；根据置信度构造可靠区域掩码，只有像素及其上下左右邻域都可靠时才参与计算；以两者二阶差分的L1距离作为结构一致性损失，按权重加入总损失。为说明二阶信息的作用，另实现只使用一阶空间差分的约束作为对照。</w:t>
             </w:r>
           </w:p>
           <w:p>
@@ -1045,7 +1045,7 @@
               <w:rPr>
                 <w:lang w:val="zh-CN"/>
               </w:rPr>
-              <w:t>选用公开数据集PASCAL VOC 2012作为主要实验数据集，该数据集共21个类别，经SBD扩充后的训练集包含10582张图像，验证集包含1449张图像。按照半监督语义分割领域通用的划分方案，分别选取92、183、366、732和1464张图像作为有标注数据，其余训练图像作为无标注数据。视实验进度，在城市街景数据集Cityscapes上进行补充验证。</w:t>
+              <w:t>实验以PASCAL VOC 2012为主。该数据集包含20个前景类别和1个背景类别，借助SBD扩充标注后共有10582张训练图像，另有1449张验证图像用于评估。参照半监督分割领域的通用设置，从精细标注的1464张训练图像中依次选取92张、183张、366张、732张以及全部1464张用作有标注样本，剩下的训练图像均视为无标注样本，实验优先在92张标注的设置下进行。若时间允许，再在Cityscapes城市街景数据集上进行补充实验。</w:t>
             </w:r>
           </w:p>
           <w:p>
@@ -1068,7 +1068,7 @@
               <w:rPr>
                 <w:lang w:val="zh-CN"/>
               </w:rPr>
-              <w:t>在上述数据集上进行模型训练与评估，采用平均交并比（mIoU）作为主要评价指标，并结合各类别IoU和边界区域的分割精度进行性能分析。通过消融实验验证空间二阶差分结构一致性约束的有效性，对比一阶差分与二阶差分约束的效果，并分析约束权重对模型性能的影响。在统一的评估设置下，与CorrMatch、DerProp、UniMatch等半监督语义分割方法进行对比，评估模型在不同标注比例下的表现。</w:t>
+              <w:t>评估以验证集上的平均交并比（mIoU）为主要指标，同时统计各类别的IoU，并用边界交并比（Boundary IoU）衡量目标边缘的分割质量。实验分三组进行：第一组在92张标注的设置下做消融，依次比较基线、加入一阶差分约束、加入二阶差分约束、两者同时加入以及去掉可靠区域掩码的效果，并考察损失权重的影响；第二组在不同标注数量下，将本方法与UniMatch、CorrMatch和DerProp进行比较，统一采用原图评估方式；第三组统计伪标签的覆盖率与准确率，并对分割结果和二阶差分响应进行可视化分析。</w:t>
             </w:r>
           </w:p>
           <w:p>
@@ -1091,18 +1091,18 @@
               <w:rPr>
                 <w:lang w:val="zh-CN"/>
               </w:rPr>
-              <w:t>本研究将构建基于二阶差分的半监督语义分割模型，通过在高置信度伪标签区域引入空间二阶差分结构一致性约束，使模型在逐像素一致性之外进一步学习局部结构信息。预期该模型在PASCAL VOC 2012的少标注设置下取得优于基线方法的分割精度，并改善目标边界和小目标区域的分割效果。</w:t>
-            </w:r>
-          </w:p>
-          <w:p>
-            <w:pPr>
-              <w:pStyle w:val="6"/>
-            </w:pPr>
-            <w:r>
-              <w:rPr>
-                <w:lang w:val="zh-CN"/>
-              </w:rPr>
-              <w:t>未来，可将该约束推广到基于Transformer的分割网络和其他半监督框架，检验其通用性，并将方法应用于医学影像、遥感等标注稀缺的领域。后续研究可进一步探索多尺度差分算子以降低对噪声的敏感性，结合更可靠的伪标签筛选策略减少错误伪标签的影响，并优化训练效率以降低计算资源开销。</w:t>
+              <w:t>本课题预期实现一个以空间二阶差分约束为核心的半监督分割模型，在逐像素一致性之外，为训练引入局部结构层面的约束。在PASCAL VOC 2012的少量标注设置下，该模型的分割精度预计高于基线，边界交并比也应有所提升；通过消融与对照实验，说明二阶差分约束在哪些条件下有效、在哪些条件下作用有限。</w:t>
+            </w:r>
+          </w:p>
+          <w:p>
+            <w:pPr>
+              <w:pStyle w:val="6"/>
+            </w:pPr>
+            <w:r>
+              <w:rPr>
+                <w:lang w:val="zh-CN"/>
+              </w:rPr>
+              <w:t>后续工作可以从三个方面展开：一是将该约束用于SegFormer等基于Transformer的网络以及其他半监督框架，考察它的适用范围；二是尝试多尺度差分或先平滑再求差分的算子，降低差分对噪声的敏感程度；三是将方法用于医学影像、遥感等标注更为稀缺的领域。</w:t>
             </w:r>
           </w:p>
         </w:tc>
@@ -1196,7 +1196,7 @@
                 <w:vertAlign w:val="baseline"/>
                 <w:lang w:eastAsia="zh-CN"/>
               </w:rPr>
-              <w:t>第一阶段（12月30日－1月20日）：初步选择论文题目，查找半监督语义分割相关文献，撰写开题报告</w:t>
+              <w:t>第一阶段（12月30日—1月20日）：确定选题，阅读半监督分割与差分算子相关文献，完成开题报告</w:t>
             </w:r>
           </w:p>
           <w:p>
@@ -1214,7 +1214,7 @@
                 <w:vertAlign w:val="baseline"/>
                 <w:lang w:eastAsia="zh-CN"/>
               </w:rPr>
-              <w:t>第二阶段（1月21日－2月11日）：处理数据集及配置模型训练环境，复现基线方法</w:t>
+              <w:t>第二阶段（1月21日—2月11日）：准备VOC和Cityscapes数据及标注划分，搭建训练环境，复现基线</w:t>
             </w:r>
           </w:p>
           <w:p>
@@ -1232,7 +1232,7 @@
                 <w:vertAlign w:val="baseline"/>
                 <w:lang w:eastAsia="zh-CN"/>
               </w:rPr>
-              <w:t>第三阶段（2月12日－3月4日）：二阶差分结构一致性模块的设计、实现与训练</w:t>
+              <w:t>第三阶段（2月12日—3月4日）：编写二阶差分结构一致性模块，完成92张标注下的主要对比实验</w:t>
             </w:r>
           </w:p>
           <w:p>
@@ -1250,7 +1250,7 @@
                 <w:vertAlign w:val="baseline"/>
                 <w:lang w:eastAsia="zh-CN"/>
               </w:rPr>
-              <w:t>第四阶段（3月5日－3月12日）：中期检查，汇报进度</w:t>
+              <w:t>第四阶段（3月5日—3月12日）：参加中期检查，汇报阶段成果并调整后续计划</w:t>
             </w:r>
           </w:p>
           <w:p>
@@ -1268,7 +1268,7 @@
                 <w:vertAlign w:val="baseline"/>
                 <w:lang w:eastAsia="zh-CN"/>
               </w:rPr>
-              <w:t>第五阶段（3月13日－4月10日）：完成对比实验与消融实验，初稿提交，文稿优化</w:t>
+              <w:t>第五阶段（3月13日—4月10日）：开展消融实验、参数分析以及其他标注比例的实验，提交论文初稿</w:t>
             </w:r>
           </w:p>
           <w:p>
@@ -1286,7 +1286,7 @@
                 <w:vertAlign w:val="baseline"/>
                 <w:lang w:eastAsia="zh-CN"/>
               </w:rPr>
-              <w:t>第六阶段（4月11日－5月5日）：撰写毕业论文，答辩稿提交</w:t>
+              <w:t>第六阶段（4月11日—5月5日）：整理实验图表，修改论文并定稿，准备答辩材料</w:t>
             </w:r>
           </w:p>
           <w:p>
@@ -1304,7 +1304,7 @@
                 <w:vertAlign w:val="baseline"/>
                 <w:lang w:eastAsia="zh-CN"/>
               </w:rPr>
-              <w:t>第七阶段（5月6日－5月15日）：准备毕业论文答辩</w:t>
+              <w:t>第七阶段（5月6日—5月15日）：完成毕业论文答辩</w:t>
             </w:r>
           </w:p>
           <w:p>

</xml_diff>

<commit_message>
Expand references to 22 entries to meet the college's requirement
</commit_message>
<xml_diff>
--- a/开题报告_赵彦丞.docx
+++ b/开题报告_赵彦丞.docx
@@ -703,7 +703,7 @@
               <w:rPr>
                 <w:lang w:val="zh-CN"/>
               </w:rPr>
-              <w:t>苏青青.半监督语义分割算法研究及应用[D].太原科技大学,2024.</w:t>
+              <w:t>戎誉,林辉,杭仁龙.边界引导与形状感知的遥感图像半监督语义分割[J/OL].中国图象图形学报,2026:1-15[2026-10-30].DOI:10.11834/jig.250575.</w:t>
             </w:r>
           </w:p>
           <w:p>
@@ -719,7 +719,7 @@
               <w:rPr>
                 <w:lang w:val="zh-CN"/>
               </w:rPr>
-              <w:t>张健荣.基于Transformer的掩码级半监督语义分割研究[D].吉林大学,2023.</w:t>
+              <w:t>苏青青.半监督语义分割算法研究及应用[D].太原科技大学,2024.</w:t>
             </w:r>
           </w:p>
           <w:p>
@@ -735,7 +735,7 @@
               <w:rPr>
                 <w:lang w:val="zh-CN"/>
               </w:rPr>
-              <w:t>冈萨雷斯,伍兹.数字图像处理[M].4版.阮秋琦,阮宇智,译.北京:电子工业出版社,2020.</w:t>
+              <w:t>张健荣.基于Transformer的掩码级半监督语义分割研究[D].吉林大学,2023.</w:t>
             </w:r>
           </w:p>
           <w:p>
@@ -751,7 +751,7 @@
               <w:rPr>
                 <w:lang w:val="zh-CN"/>
               </w:rPr>
-              <w:t>Sun B ,Yang Y ,Zhang L , et al. CorrMatch: Label Propagation via Correlation Matching for Semi-Supervised Semantic Segmentation [C]//2024 IEEE/CVF Conference on Computer Vision and Pattern Recognition (CVPR). 2024: 3097-3107. DOI:10.1109/CVPR52733.2024.00299.</w:t>
+              <w:t>冈萨雷斯,伍兹.数字图像处理[M].4版.阮秋琦,阮宇智,译.北京:电子工业出版社,2020.</w:t>
             </w:r>
           </w:p>
           <w:p>
@@ -767,7 +767,7 @@
               <w:rPr>
                 <w:lang w:val="zh-CN"/>
               </w:rPr>
-              <w:t>Fu Y ,Guo X . Semi-Supervised Semantic Segmentation via Derivative Label Propagation [J]. Proceedings of the AAAI Conference on Artificial Intelligence, 2026, 40 (5): 4058-4066. DOI:10.1609/aaai.v40i5.37409.</w:t>
+              <w:t>Sun B ,Yang Y ,Zhang L , et al. CorrMatch: Label Propagation via Correlation Matching for Semi-Supervised Semantic Segmentation [C]//2024 IEEE/CVF Conference on Computer Vision and Pattern Recognition (CVPR). 2024: 3097-3107. DOI:10.1109/CVPR52733.2024.00299.</w:t>
             </w:r>
           </w:p>
           <w:p>
@@ -783,7 +783,7 @@
               <w:rPr>
                 <w:lang w:val="zh-CN"/>
               </w:rPr>
-              <w:t>Yang L ,Qi L ,Feng L , et al. Revisiting Weak-to-Strong Consistency in Semi-Supervised Semantic Segmentation [C]//2023 IEEE/CVF Conference on Computer Vision and Pattern Recognition (CVPR). 2023: 7236-7246. DOI:10.1109/CVPR52729.2023.00699.</w:t>
+              <w:t>Fu Y ,Guo X . Semi-Supervised Semantic Segmentation via Derivative Label Propagation [J]. Proceedings of the AAAI Conference on Artificial Intelligence, 2026, 40 (5): 4058-4066. DOI:10.1609/aaai.v40i5.37409.</w:t>
             </w:r>
           </w:p>
           <w:p>
@@ -799,7 +799,7 @@
               <w:rPr>
                 <w:lang w:val="zh-CN"/>
               </w:rPr>
-              <w:t>Yang L ,Zhao Z ,Zhao H . UniMatch V2: Pushing the Limit of Semi-Supervised Semantic Segmentation [J]. IEEE Transactions on Pattern Analysis and Machine Intelligence, 2025, 47 (4): 3031-3048. DOI:10.1109/TPAMI.2025.3528453.</w:t>
+              <w:t>Yang L ,Qi L ,Feng L , et al. Revisiting Weak-to-Strong Consistency in Semi-Supervised Semantic Segmentation [C]//2023 IEEE/CVF Conference on Computer Vision and Pattern Recognition (CVPR). 2023: 7236-7246. DOI:10.1109/CVPR52729.2023.00699.</w:t>
             </w:r>
           </w:p>
           <w:p>
@@ -815,7 +815,7 @@
               <w:rPr>
                 <w:lang w:val="zh-CN"/>
               </w:rPr>
-              <w:t>Liu P ,Liu J . When Confidence Fails: Revisiting Pseudo-Label Selection in Semi-Supervised Semantic Segmentation [C]//2025 IEEE/CVF International Conference on Computer Vision (ICCV). 2025: 21874-21884. DOI:10.1109/ICCV51701.2025.02031.</w:t>
+              <w:t>Yang L ,Zhao Z ,Zhao H . UniMatch V2: Pushing the Limit of Semi-Supervised Semantic Segmentation [J]. IEEE Transactions on Pattern Analysis and Machine Intelligence, 2025, 47 (4): 3031-3048. DOI:10.1109/TPAMI.2025.3528453.</w:t>
             </w:r>
           </w:p>
           <w:p>
@@ -831,7 +831,7 @@
               <w:rPr>
                 <w:lang w:val="zh-CN"/>
               </w:rPr>
-              <w:t>Su Z ,Liu W ,Yu Z , et al. Pixel Difference Networks for Efficient Edge Detection [C]//2021 IEEE/CVF International Conference on Computer Vision (ICCV). 2021: 5097-5107. DOI:10.1109/ICCV48922.2021.00507.</w:t>
+              <w:t>Liu P ,Liu J . When Confidence Fails: Revisiting Pseudo-Label Selection in Semi-Supervised Semantic Segmentation [C]//2025 IEEE/CVF International Conference on Computer Vision (ICCV). 2025: 21874-21884. DOI:10.1109/ICCV51701.2025.02031.</w:t>
             </w:r>
           </w:p>
           <w:p>
@@ -847,7 +847,7 @@
               <w:rPr>
                 <w:lang w:val="zh-CN"/>
               </w:rPr>
-              <w:t>Everingham M ,Van Gool L ,Williams C K I , et al. The Pascal Visual Object Classes (VOC) Challenge [J]. International Journal of Computer Vision, 2010, 88 (2): 303-338. DOI:10.1007/s11263-009-0275-4.</w:t>
+              <w:t>Su Z ,Liu W ,Yu Z , et al. Pixel Difference Networks for Efficient Edge Detection [C]//2021 IEEE/CVF International Conference on Computer Vision (ICCV). 2021: 5097-5107. DOI:10.1109/ICCV48922.2021.00507.</w:t>
             </w:r>
           </w:p>
           <w:p>
@@ -863,7 +863,151 @@
               <w:rPr>
                 <w:lang w:val="zh-CN"/>
               </w:rPr>
+              <w:t>Everingham M ,Van Gool L ,Williams C K I , et al. The Pascal Visual Object Classes (VOC) Challenge [J]. International Journal of Computer Vision, 2010, 88 (2): 303-338. DOI:10.1007/s11263-009-0275-4.</w:t>
+            </w:r>
+          </w:p>
+          <w:p>
+            <w:pPr>
+              <w:numPr>
+                <w:ilvl w:val="0"/>
+                <w:numId w:val="1"/>
+              </w:numPr>
+              <w:pStyle w:val="6"/>
+              <w:ind w:left="610"/>
+            </w:pPr>
+            <w:r>
+              <w:rPr>
+                <w:lang w:val="zh-CN"/>
+              </w:rPr>
               <w:t>Cordts M ,Omran M ,Ramos S , et al. The Cityscapes Dataset for Semantic Urban Scene Understanding [C]//2016 IEEE Conference on Computer Vision and Pattern Recognition (CVPR). 2016: 3213-3223. DOI:10.1109/CVPR.2016.350.</w:t>
+            </w:r>
+          </w:p>
+          <w:p>
+            <w:pPr>
+              <w:numPr>
+                <w:ilvl w:val="0"/>
+                <w:numId w:val="1"/>
+              </w:numPr>
+              <w:pStyle w:val="6"/>
+              <w:ind w:left="610"/>
+            </w:pPr>
+            <w:r>
+              <w:rPr>
+                <w:lang w:val="zh-CN"/>
+              </w:rPr>
+              <w:t>Grubišić I ,Oršić M ,Šegvić S . Revisiting Consistency for Semi-Supervised Semantic Segmentation [J]. Sensors, 2023, 23 (2): 940. DOI:10.3390/s23020940.</w:t>
+            </w:r>
+          </w:p>
+          <w:p>
+            <w:pPr>
+              <w:numPr>
+                <w:ilvl w:val="0"/>
+                <w:numId w:val="1"/>
+              </w:numPr>
+              <w:pStyle w:val="6"/>
+              <w:ind w:left="610"/>
+            </w:pPr>
+            <w:r>
+              <w:rPr>
+                <w:lang w:val="zh-CN"/>
+              </w:rPr>
+              <w:t>Huang H ,Luo X ,Xu S , et al. Twin Pseudo-training for semi-supervised semantic segmentation [J]. Computers &amp; Graphics, 2023, 115: 348-358. DOI:10.1016/j.cag.2023.07.009.</w:t>
+            </w:r>
+          </w:p>
+          <w:p>
+            <w:pPr>
+              <w:numPr>
+                <w:ilvl w:val="0"/>
+                <w:numId w:val="1"/>
+              </w:numPr>
+              <w:pStyle w:val="6"/>
+              <w:ind w:left="610"/>
+            </w:pPr>
+            <w:r>
+              <w:rPr>
+                <w:lang w:val="zh-CN"/>
+              </w:rPr>
+              <w:t>Hou Y ,Gould S ,Zheng L . View-coherent correlation consistency for semi-supervised semantic segmentation [J]. Pattern Recognition, 2024, 147: 110089. DOI:10.1016/j.patcog.2023.110089.</w:t>
+            </w:r>
+          </w:p>
+          <w:p>
+            <w:pPr>
+              <w:numPr>
+                <w:ilvl w:val="0"/>
+                <w:numId w:val="1"/>
+              </w:numPr>
+              <w:pStyle w:val="6"/>
+              <w:ind w:left="610"/>
+            </w:pPr>
+            <w:r>
+              <w:rPr>
+                <w:lang w:val="zh-CN"/>
+              </w:rPr>
+              <w:t>Chang X ,Chen C ,Shan C . Enhancing the utilization of uncertain pixels in semi-supervised semantic segmentation [J]. Neurocomputing, 2024, 610: 128598. DOI:10.1016/j.neucom.2024.128598.</w:t>
+            </w:r>
+          </w:p>
+          <w:p>
+            <w:pPr>
+              <w:numPr>
+                <w:ilvl w:val="0"/>
+                <w:numId w:val="1"/>
+              </w:numPr>
+              <w:pStyle w:val="6"/>
+              <w:ind w:left="610"/>
+            </w:pPr>
+            <w:r>
+              <w:rPr>
+                <w:lang w:val="zh-CN"/>
+              </w:rPr>
+              <w:t>Dong J ,Meng Z ,Liu D , et al. Boundary-refined prototype generation: A general end-to-end paradigm for semi-supervised semantic segmentation [J]. Engineering Applications of Artificial Intelligence, 2024, 137: 109021. DOI:10.1016/j.engappai.2024.109021.</w:t>
+            </w:r>
+          </w:p>
+          <w:p>
+            <w:pPr>
+              <w:numPr>
+                <w:ilvl w:val="0"/>
+                <w:numId w:val="1"/>
+              </w:numPr>
+              <w:pStyle w:val="6"/>
+              <w:ind w:left="610"/>
+            </w:pPr>
+            <w:r>
+              <w:rPr>
+                <w:lang w:val="zh-CN"/>
+              </w:rPr>
+              <w:t>Hu K ,Chen X ,Chen Z , et al. Multi-Perspective Pseudo-Label Generation and Confidence-Weighted Training for Semi-Supervised Semantic Segmentation [J]. IEEE Transactions on Multimedia, 2025, 27: 300-311. DOI:10.1109/TMM.2024.3521801.</w:t>
+            </w:r>
+          </w:p>
+          <w:p>
+            <w:pPr>
+              <w:numPr>
+                <w:ilvl w:val="0"/>
+                <w:numId w:val="1"/>
+              </w:numPr>
+              <w:pStyle w:val="6"/>
+              <w:ind w:left="610"/>
+            </w:pPr>
+            <w:r>
+              <w:rPr>
+                <w:lang w:val="zh-CN"/>
+              </w:rPr>
+              <w:t>Ishikawa H ,Aoki Y . BoundMatch: Boundary Detection Applied to Semi-Supervised Segmentation [J]. IEEE Access, 2025, 13: 172776-172798. DOI:10.1109/ACCESS.2025.3617037.</w:t>
+            </w:r>
+          </w:p>
+          <w:p>
+            <w:pPr>
+              <w:numPr>
+                <w:ilvl w:val="0"/>
+                <w:numId w:val="1"/>
+              </w:numPr>
+              <w:pStyle w:val="6"/>
+              <w:ind w:left="610"/>
+            </w:pPr>
+            <w:r>
+              <w:rPr>
+                <w:lang w:val="zh-CN"/>
+              </w:rPr>
+              <w:t>Sheng F ,Zhu Y ,Jin L , et al. Semi-supervised semantic segmentation with confidence-driven consistency learning [J]. Expert Systems with Applications, 2026, 296: 128965. DOI:10.1016/j.eswa.2025.128965.</w:t>
             </w:r>
           </w:p>
         </w:tc>

</xml_diff>